<commit_message>
docs: acidwg_py 매뉴얼 v3 — operational --seasons 일괄 모드 반영
[v2 대비 변경]
- 1.2 출력 트리에 operational 일괄 (한 해 12 계절) 예시 추가
- 5.4 자동 분리 표 — operational 단일/일괄/hindcast 3행으로 확장
- 6장 Operational 워크플로우 전면 개편:
  * 6.1 패턴 A — 단일 시즌 (기존)
  * 6.2 패턴 B — 한 해 여러 시즌 일괄 (★ 신규, --seasons all/list/dry-run)
  * 6.3 yaml.operational 블록 — season 은 단일 기본, --seasons 사용 시 무시 명시
  * 6.4 yaml 자동 탐색 우선순위 (변경 없음)
- 8.3 operational 표에 'CLI --seasons 사용 시 yaml.season 무시' 안내 추가
- 8.6 model.retrieve 설명에 operational 일괄 시 첫 시즌 적합·캐시 재사용 동작 추가
- 11.5 신규 — '지원하지 않는 계절 코드' 트러블슈팅
- 11.11 신규 — 'months 직접 지정 시 --seasons 일괄 모드 비호환'
- 12.5 신규 — Cook 의 2025 × 12 계절 일괄 실행 예시
- 부록 B CLI 표 — operational --seasons 4개 신규 추가
- 12.1 / 12.6 / 7.6: 관측소 ID 예시를 USAF 6자 (918430) 로 갱신 (GSOD ID 단순화 반영)

총 12장 + 5개 부록, 49.9 KB.
</commit_message>
<xml_diff>
--- a/docs/acidwg_py_사용자매뉴얼.docx
+++ b/docs/acidwg_py_사용자매뉴얼.docx
@@ -46,7 +46,7 @@
         <w:br/>
         <w:t>PICASO-Hydro 사업</w:t>
         <w:br/>
-        <w:t>v2 — 2026-05</w:t>
+        <w:t>v3 — 2026-05</w:t>
       </w:r>
     </w:p>
     <w:p>
@@ -95,7 +95,7 @@
           <w:sz w:val="22"/>
           <w:rFonts w:eastAsia="맑은 고딕" w:ascii="맑은 고딕" w:hAnsi="맑은 고딕"/>
         </w:rPr>
-        <w:t>operational — 미래 한 시즌 (예: 2024 JFM) 시나리오 생성. 정책·운영 의사결정용</w:t>
+        <w:t>operational — 미래 (또는 현재) 시나리오. 단일 시즌 또는 한 해의 여러 시즌 일괄. 정책·운영 의사결정용</w:t>
       </w:r>
     </w:p>
     <w:p>
@@ -362,7 +362,7 @@
           <w:sz w:val="22"/>
           <w:rFonts w:eastAsia="맑은 고딕" w:ascii="맑은 고딕" w:hAnsi="맑은 고딕"/>
         </w:rPr>
-        <w:t>operational (단일) 또는 hindcast (일괄) 실행 후 다음 구조의 출력을 생성:</w:t>
+        <w:t>operational (단일/일괄) 또는 hindcast (다년 일괄) 실행 후 다음 구조의 출력을 생성:</w:t>
       </w:r>
     </w:p>
     <w:p>
@@ -378,19 +378,25 @@
         </w:rPr>
         <w:t>1_acidwg/</w:t>
         <w:br/>
-        <w:t>├─ operational/2024/JFM/                     ← acidwg-run</w:t>
+        <w:t>├─ operational/</w:t>
         <w:br/>
-        <w:t>│   ├─ member_0001/91843099999.csv  (90일 일자료)</w:t>
+        <w:t>│   ├─ 2024/JFM/                            ← acidwg-run               (단일)</w:t>
         <w:br/>
-        <w:t>│   ├─ member_0002/...</w:t>
+        <w:t>│   │   ├─ member_0001/91843099999.csv</w:t>
         <w:br/>
-        <w:t>│   └─ member_1000/</w:t>
+        <w:t>│   │   └─ ... member_1000/</w:t>
         <w:br/>
-        <w:t>└─ hindcast/                                ← acidwg-run --hindcast</w:t>
+        <w:t>│   └─ 2025/                                ← acidwg-run --seasons all (일괄)</w:t>
+        <w:br/>
+        <w:t>│       ├─ JFM/member_0001/...</w:t>
+        <w:br/>
+        <w:t>│       ├─ FMA/member_0001/...</w:t>
+        <w:br/>
+        <w:t>│       └─ ... (12 계절)</w:t>
+        <w:br/>
+        <w:t>└─ hindcast/                                ← acidwg-run --hindcast    (다년)</w:t>
         <w:br/>
         <w:t xml:space="preserve">    ├─ 1991/JFM/member_0001/...</w:t>
-        <w:br/>
-        <w:t xml:space="preserve">    ├─ 1991/FMA/member_0001/...</w:t>
         <w:br/>
         <w:t xml:space="preserve">    ├─ ...</w:t>
         <w:br/>
@@ -800,7 +806,7 @@
                 <w:sz w:val="20"/>
                 <w:rFonts w:eastAsia="맑은 고딕" w:ascii="맑은 고딕" w:hAnsi="맑은 고딕"/>
               </w:rPr>
-              <w:t>0_database/obs/weather/daily_std/</w:t>
+              <w:t>0_database/obs/weather/daily_std/ 또는 gsod/daily_std/</w:t>
             </w:r>
           </w:p>
         </w:tc>
@@ -1003,7 +1009,7 @@
                 <w:sz w:val="20"/>
                 <w:rFonts w:eastAsia="맑은 고딕" w:ascii="맑은 고딕" w:hAnsi="맑은 고딕"/>
               </w:rPr>
-              <w:t>★ operational 1000-멤버 시나리오 (단일 시즌)</w:t>
+              <w:t>★ operational 1000-멤버 시나리오 (단일 또는 일괄)</w:t>
             </w:r>
           </w:p>
         </w:tc>
@@ -1018,7 +1024,7 @@
                 <w:sz w:val="20"/>
                 <w:rFonts w:eastAsia="맑은 고딕" w:ascii="맑은 고딕" w:hAnsi="맑은 고딕"/>
               </w:rPr>
-              <w:t>Step 2: acidwg-run</w:t>
+              <w:t>Step 2: acidwg-run [--seasons ...]</w:t>
             </w:r>
           </w:p>
         </w:tc>
@@ -1174,21 +1180,25 @@
         <w:br/>
         <w:t xml:space="preserve">    │   ├─ 2024_JFM_picaso.csv</w:t>
         <w:br/>
-        <w:t xml:space="preserve">    │   └─ 1991_JFM_picaso.csv         (hindcast 시 30년치 필요)</w:t>
+        <w:t xml:space="preserve">    │   └─ ...</w:t>
         <w:br/>
         <w:t xml:space="preserve">    ├─ operational\                   ★ Step 2 — operational 결과</w:t>
         <w:br/>
-        <w:t xml:space="preserve">    │   └─ 2024\JFM\member_NNNN\</w:t>
+        <w:t xml:space="preserve">    │   └─ 2025\</w:t>
+        <w:br/>
+        <w:t xml:space="preserve">    │       ├─ JFM\member_NNNN\</w:t>
+        <w:br/>
+        <w:t xml:space="preserve">    │       ├─ FMA\member_NNNN\</w:t>
+        <w:br/>
+        <w:t xml:space="preserve">    │       └─ ... (12 계절)</w:t>
         <w:br/>
         <w:t xml:space="preserve">    ├─ hindcast\                      ★ Step 2 — hindcast 결과</w:t>
         <w:br/>
         <w:t xml:space="preserve">    │   ├─ 1991\JFM\member_NNNN\</w:t>
         <w:br/>
-        <w:t xml:space="preserve">    │   ├─ 1991\FMA\...</w:t>
+        <w:t xml:space="preserve">    │   └─ ... (다년 × 다계절)</w:t>
         <w:br/>
-        <w:t xml:space="preserve">    │   └─ 2020\DJF\...</w:t>
-        <w:br/>
-        <w:t xml:space="preserve">    └─ cache\acidwg_model.pkl          모델 캐시 (operational only)</w:t>
+        <w:t xml:space="preserve">    └─ cache\acidwg_model.pkl          모델 캐시</w:t>
       </w:r>
     </w:p>
     <w:p>
@@ -1483,7 +1493,7 @@
                 <w:sz w:val="20"/>
                 <w:rFonts w:eastAsia="맑은 고딕" w:ascii="맑은 고딕" w:hAnsi="맑은 고딕"/>
               </w:rPr>
-              <w:t>91843099999 또는 918430</w:t>
+              <w:t>918430 (USAF 6자) 또는 91843099999 (USAF+WBAN 11자)</w:t>
             </w:r>
           </w:p>
         </w:tc>
@@ -1590,7 +1600,7 @@
           <w:sz w:val="22"/>
           <w:rFonts w:eastAsia="맑은 고딕" w:ascii="맑은 고딕" w:hAnsi="맑은 고딕"/>
         </w:rPr>
-        <w:t>ID 는 stations.csv·관측 CSV 파일명·PICASO 격자 추출 모두 정확히 동일해야 합니다. GSOD 에서는 USAF 6자 (예: 918430) 또는 USAF+WBAN 11자 (예: 91843099999) — util_py 의 util-gsod-download 가 자동으로 생성한 파일명을 그대로 사용 권장.</w:t>
+        <w:t>ID 는 stations.csv·관측 CSV 파일명·PICASO 격자 추출 모두 정확히 동일해야 합니다. GSOD 에서는 USAF 6자 (예: 918430) 또는 USAF+WBAN 11자 (예: 91843099999) — util_py 의 util-gsod-download 가 자동 생성한 파일명을 그대로 사용 권장.</w:t>
       </w:r>
     </w:p>
     <w:p>
@@ -1611,7 +1621,7 @@
           <w:sz w:val="22"/>
           <w:rFonts w:eastAsia="맑은 고딕" w:ascii="맑은 고딕" w:hAnsi="맑은 고딕"/>
         </w:rPr>
-        <w:t>위치: 0_database/obs/weather/daily_std/{ID}.csv</w:t>
+        <w:t>위치: 0_database/obs/weather/daily_std/{ID}.csv (또는 gsod/daily_std/)</w:t>
       </w:r>
     </w:p>
     <w:p>
@@ -1918,8 +1928,6 @@
         <w:t>util-weather-standardize --source gsod</w:t>
         <w:br/>
         <w:t xml:space="preserve">  → 0_database/gsod/daily_std/{ID}.csv 생성</w:t>
-        <w:br/>
-        <w:t xml:space="preserve">  (또는 acidwg_py.yaml 의 obs_dir 를 daily_std 위치로 설정)</w:t>
       </w:r>
     </w:p>
     <w:p>
@@ -2173,7 +2181,7 @@
                 <w:sz w:val="20"/>
                 <w:rFonts w:eastAsia="맑은 고딕" w:ascii="맑은 고딕" w:hAnsi="맑은 고딕"/>
               </w:rPr>
-              <w:t>실제 미래</w:t>
+              <w:t>실제 미래 (또는 현재)</w:t>
             </w:r>
           </w:p>
         </w:tc>
@@ -2375,7 +2383,7 @@
         <w:rPr>
           <w:rFonts w:eastAsia="맑은 고딕" w:ascii="맑은 고딕" w:hAnsi="맑은 고딕"/>
         </w:rPr>
-        <w:t>5.3 한 폴더로 합치면 안 되는 4가지 실무적 이유</w:t>
+        <w:t>5.3 한 폴더로 합치면 안 되는 4가지 이유</w:t>
       </w:r>
     </w:p>
     <w:p>
@@ -2415,7 +2423,7 @@
           <w:sz w:val="22"/>
           <w:rFonts w:eastAsia="맑은 고딕" w:ascii="맑은 고딕" w:hAnsi="맑은 고딕"/>
         </w:rPr>
-        <w:t>Hindcast 결과를 별도로 두고 그 시점 관측과 비교 → CRPS, BSS 같은 skill score 산출. Operational 시나리오에 이 skill 정보를 사후 적용 (bias 보정, 신뢰구간 폭 조정). 두 흐름이 분리되어야 깨끗한 평가→보정→적용 파이프라인 가능.</w:t>
+        <w:t>Hindcast 결과를 별도로 두고 그 시점 관측과 비교 → CRPS, BSS 같은 skill score 산출. Operational 시나리오에 이 skill 정보를 사후 적용 (bias 보정, 신뢰구간 폭 조정).</w:t>
       </w:r>
     </w:p>
     <w:p>
@@ -2455,7 +2463,7 @@
           <w:sz w:val="22"/>
           <w:rFonts w:eastAsia="맑은 고딕" w:ascii="맑은 고딕" w:hAnsi="맑은 고딕"/>
         </w:rPr>
-        <w:t>Hindcast: 한 번에 30년 × 12 계절 = 360 시즌 일괄 → 오래 걸리는 배치 잡 (수 시간 ~ 수 일). Operational: 매 계절 1개씩 운영 스케줄에 맞춰 실행. 다른 트리거, 다른 로깅, 다른 알람.</w:t>
+        <w:t>Hindcast: 한 번에 30년 × 12 계절 = 360 시즌 일괄 → 오래 걸리는 배치 잡 (수 시간 ~ 수 일). Operational: 매 계절 1개씩 (또는 한 해 12 계절) 운영 스케줄에 맞춰 실행. 다른 트리거, 다른 로깅, 다른 알람.</w:t>
       </w:r>
     </w:p>
     <w:p>
@@ -2494,7 +2502,7 @@
       <w:tr>
         <w:tc>
           <w:tcPr>
-            <w:tcW w:type="dxa" w:w="1417"/>
+            <w:tcW w:type="dxa" w:w="1984"/>
           </w:tcPr>
           <w:p>
             <w:r/>
@@ -2526,7 +2534,7 @@
         </w:tc>
         <w:tc>
           <w:tcPr>
-            <w:tcW w:type="dxa" w:w="2551"/>
+            <w:tcW w:type="dxa" w:w="2835"/>
           </w:tcPr>
           <w:p>
             <w:r/>
@@ -2542,7 +2550,7 @@
         </w:tc>
         <w:tc>
           <w:tcPr>
-            <w:tcW w:type="dxa" w:w="3402"/>
+            <w:tcW w:type="dxa" w:w="2835"/>
           </w:tcPr>
           <w:p>
             <w:r/>
@@ -2560,7 +2568,7 @@
       <w:tr>
         <w:tc>
           <w:tcPr>
-            <w:tcW w:type="dxa" w:w="1417"/>
+            <w:tcW w:type="dxa" w:w="1984"/>
           </w:tcPr>
           <w:p>
             <w:r/>
@@ -2569,7 +2577,7 @@
                 <w:sz w:val="20"/>
                 <w:rFonts w:eastAsia="맑은 고딕" w:ascii="맑은 고딕" w:hAnsi="맑은 고딕"/>
               </w:rPr>
-              <w:t>operational</w:t>
+              <w:t>operational (단일)</w:t>
             </w:r>
           </w:p>
         </w:tc>
@@ -2590,7 +2598,7 @@
         </w:tc>
         <w:tc>
           <w:tcPr>
-            <w:tcW w:type="dxa" w:w="2551"/>
+            <w:tcW w:type="dxa" w:w="2835"/>
           </w:tcPr>
           <w:p>
             <w:r/>
@@ -2605,7 +2613,7 @@
         </w:tc>
         <w:tc>
           <w:tcPr>
-            <w:tcW w:type="dxa" w:w="3402"/>
+            <w:tcW w:type="dxa" w:w="2835"/>
           </w:tcPr>
           <w:p>
             <w:r/>
@@ -2614,7 +2622,7 @@
                 <w:sz w:val="20"/>
                 <w:rFonts w:eastAsia="맑은 고딕" w:ascii="맑은 고딕" w:hAnsi="맑은 고딕"/>
               </w:rPr>
-              <w:t>1_acidwg/operational/{year}/{season}/</w:t>
+              <w:t>operational/{year}/{season}/</w:t>
             </w:r>
           </w:p>
         </w:tc>
@@ -2622,7 +2630,69 @@
       <w:tr>
         <w:tc>
           <w:tcPr>
-            <w:tcW w:type="dxa" w:w="1417"/>
+            <w:tcW w:type="dxa" w:w="1984"/>
+          </w:tcPr>
+          <w:p>
+            <w:r/>
+            <w:r>
+              <w:rPr>
+                <w:sz w:val="20"/>
+                <w:rFonts w:eastAsia="맑은 고딕" w:ascii="맑은 고딕" w:hAnsi="맑은 고딕"/>
+              </w:rPr>
+              <w:t>operational (일괄)</w:t>
+            </w:r>
+          </w:p>
+        </w:tc>
+        <w:tc>
+          <w:tcPr>
+            <w:tcW w:type="dxa" w:w="1701"/>
+          </w:tcPr>
+          <w:p>
+            <w:r/>
+            <w:r>
+              <w:rPr>
+                <w:sz w:val="20"/>
+                <w:rFonts w:eastAsia="맑은 고딕" w:ascii="맑은 고딕" w:hAnsi="맑은 고딕"/>
+              </w:rPr>
+              <w:t>operational:</w:t>
+            </w:r>
+          </w:p>
+        </w:tc>
+        <w:tc>
+          <w:tcPr>
+            <w:tcW w:type="dxa" w:w="2835"/>
+          </w:tcPr>
+          <w:p>
+            <w:r/>
+            <w:r>
+              <w:rPr>
+                <w:sz w:val="20"/>
+                <w:rFonts w:eastAsia="맑은 고딕" w:ascii="맑은 고딕" w:hAnsi="맑은 고딕"/>
+              </w:rPr>
+              <w:t>acidwg-run --seasons all</w:t>
+            </w:r>
+          </w:p>
+        </w:tc>
+        <w:tc>
+          <w:tcPr>
+            <w:tcW w:type="dxa" w:w="2835"/>
+          </w:tcPr>
+          <w:p>
+            <w:r/>
+            <w:r>
+              <w:rPr>
+                <w:sz w:val="20"/>
+                <w:rFonts w:eastAsia="맑은 고딕" w:ascii="맑은 고딕" w:hAnsi="맑은 고딕"/>
+              </w:rPr>
+              <w:t>operational/{year}/{season}/</w:t>
+            </w:r>
+          </w:p>
+        </w:tc>
+      </w:tr>
+      <w:tr>
+        <w:tc>
+          <w:tcPr>
+            <w:tcW w:type="dxa" w:w="1984"/>
           </w:tcPr>
           <w:p>
             <w:r/>
@@ -2652,7 +2722,7 @@
         </w:tc>
         <w:tc>
           <w:tcPr>
-            <w:tcW w:type="dxa" w:w="2551"/>
+            <w:tcW w:type="dxa" w:w="2835"/>
           </w:tcPr>
           <w:p>
             <w:r/>
@@ -2667,7 +2737,7 @@
         </w:tc>
         <w:tc>
           <w:tcPr>
-            <w:tcW w:type="dxa" w:w="3402"/>
+            <w:tcW w:type="dxa" w:w="2835"/>
           </w:tcPr>
           <w:p>
             <w:r/>
@@ -2676,7 +2746,7 @@
                 <w:sz w:val="20"/>
                 <w:rFonts w:eastAsia="맑은 고딕" w:ascii="맑은 고딕" w:hAnsi="맑은 고딕"/>
               </w:rPr>
-              <w:t>1_acidwg/hindcast/{year}/{season}/</w:t>
+              <w:t>hindcast/{year}/{season}/</w:t>
             </w:r>
           </w:p>
         </w:tc>
@@ -2706,7 +2776,7 @@
           <w:rFonts w:eastAsia="맑은 고딕" w:ascii="맑은 고딕" w:hAnsi="맑은 고딕"/>
           <w:color w:val="1F4E79"/>
         </w:rPr>
-        <w:t>6. Operational 워크플로우 (단일 시즌)</w:t>
+        <w:t>6. Operational 워크플로우</w:t>
       </w:r>
     </w:p>
     <w:p>
@@ -2716,7 +2786,7 @@
           <w:sz w:val="22"/>
           <w:rFonts w:eastAsia="맑은 고딕" w:ascii="맑은 고딕" w:hAnsi="맑은 고딕"/>
         </w:rPr>
-        <w:t>예시: 2024년 1-3월 (JFM) 시나리오 1000 멤버 생성</w:t>
+        <w:t>Operational 모드는 "단일 시즌" 또는 "한 해의 여러 시즌" 두 가지 사용 패턴을 지원합니다.</w:t>
       </w:r>
     </w:p>
     <w:p>
@@ -2727,7 +2797,7 @@
         <w:rPr>
           <w:rFonts w:eastAsia="맑은 고딕" w:ascii="맑은 고딕" w:hAnsi="맑은 고딕"/>
         </w:rPr>
-        <w:t>6.1 Step 1 — PICASO 원본 → forecast CSV</w:t>
+        <w:t>6.1 패턴 A — 단일 시즌 (예: 2024 JFM)</w:t>
       </w:r>
     </w:p>
     <w:p>
@@ -2744,6 +2814,10 @@
         <w:t>set PICASO_ROOT=I:\2025-APCC_Cook\PICASO-Hydro</w:t>
         <w:br/>
         <w:t>acidwg-picaso-convert --seasons JFM --years 2024</w:t>
+        <w:br/>
+        <w:t># yaml.operational.year=2024, season="JFM" 으로 설정</w:t>
+        <w:br/>
+        <w:t>acidwg-run</w:t>
       </w:r>
     </w:p>
     <w:p>
@@ -2753,7 +2827,7 @@
           <w:sz w:val="22"/>
           <w:rFonts w:eastAsia="맑은 고딕" w:ascii="맑은 고딕" w:hAnsi="맑은 고딕"/>
         </w:rPr>
-        <w:t>출력: 1_acidwg/picaso/2024_JFM_picaso.csv</w:t>
+        <w:t>결과: 1_acidwg/operational/2024/JFM/member_0001 ~ member_1000/</w:t>
       </w:r>
     </w:p>
     <w:p>
@@ -2764,7 +2838,129 @@
         <w:rPr>
           <w:rFonts w:eastAsia="맑은 고딕" w:ascii="맑은 고딕" w:hAnsi="맑은 고딕"/>
         </w:rPr>
-        <w:t>6.2 Step 2 — acidwg_py.yaml 작성 (operational 블록만)</w:t>
+        <w:t>6.2 패턴 B — 한 해 여러 시즌 일괄 (★ 신규)</w:t>
+      </w:r>
+    </w:p>
+    <w:p>
+      <w:r>
+        <w:rPr>
+          <w:b w:val="0"/>
+          <w:sz w:val="22"/>
+          <w:rFonts w:eastAsia="맑은 고딕" w:ascii="맑은 고딕" w:hAnsi="맑은 고딕"/>
+        </w:rPr>
+        <w:t>yaml 의 operational.year 는 그대로 두고, --seasons 플래그로 일괄 실행:</w:t>
+      </w:r>
+    </w:p>
+    <w:p>
+      <w:pPr>
+        <w:spacing w:before="80" w:after="80"/>
+        <w:ind w:left="283"/>
+        <w:shd w:val="clear" w:color="auto" w:fill="F2F2F2"/>
+      </w:pPr>
+      <w:r>
+        <w:rPr>
+          <w:rFonts w:ascii="Consolas" w:hAnsi="Consolas"/>
+          <w:sz w:val="20"/>
+        </w:rPr>
+        <w:t>set PICASO_ROOT=I:\2025-APCC_Cook\PICASO-Hydro</w:t>
+        <w:br/>
+        <w:br/>
+        <w:t># 처리 대상 + forecast CSV 존재 여부 미리 확인</w:t>
+        <w:br/>
+        <w:t>acidwg-run --seasons all --dry-run</w:t>
+        <w:br/>
+        <w:br/>
+        <w:t># 12 계절 모두 실행 (한 해)</w:t>
+        <w:br/>
+        <w:t>acidwg-run --seasons all</w:t>
+        <w:br/>
+        <w:br/>
+        <w:t># 일부 계절만</w:t>
+        <w:br/>
+        <w:t>acidwg-run --seasons JFM FMA MAM</w:t>
+        <w:br/>
+        <w:t>acidwg-run --seasons jfm fma          # 대소문자 무관</w:t>
+      </w:r>
+    </w:p>
+    <w:p>
+      <w:r>
+        <w:rPr>
+          <w:b w:val="0"/>
+          <w:sz w:val="22"/>
+          <w:rFonts w:eastAsia="맑은 고딕" w:ascii="맑은 고딕" w:hAnsi="맑은 고딕"/>
+        </w:rPr>
+        <w:t>동작:</w:t>
+      </w:r>
+    </w:p>
+    <w:p>
+      <w:pPr>
+        <w:pStyle w:val="ListBullet"/>
+      </w:pPr>
+      <w:r>
+        <w:rPr>
+          <w:sz w:val="22"/>
+          <w:rFonts w:eastAsia="맑은 고딕" w:ascii="맑은 고딕" w:hAnsi="맑은 고딕"/>
+        </w:rPr>
+        <w:t>yaml.operational.year (예: 2025) 가 그대로 사용됨</w:t>
+      </w:r>
+    </w:p>
+    <w:p>
+      <w:pPr>
+        <w:pStyle w:val="ListBullet"/>
+      </w:pPr>
+      <w:r>
+        <w:rPr>
+          <w:sz w:val="22"/>
+          <w:rFonts w:eastAsia="맑은 고딕" w:ascii="맑은 고딕" w:hAnsi="맑은 고딕"/>
+        </w:rPr>
+        <w:t>지정한 계절들을 순차 처리, 각각 1000 멤버 생성</w:t>
+      </w:r>
+    </w:p>
+    <w:p>
+      <w:pPr>
+        <w:pStyle w:val="ListBullet"/>
+      </w:pPr>
+      <w:r>
+        <w:rPr>
+          <w:sz w:val="22"/>
+          <w:rFonts w:eastAsia="맑은 고딕" w:ascii="맑은 고딕" w:hAnsi="맑은 고딕"/>
+        </w:rPr>
+        <w:t>출력은 operational/{year}/{season}/ 별로 자동 분리</w:t>
+      </w:r>
+    </w:p>
+    <w:p>
+      <w:pPr>
+        <w:pStyle w:val="ListBullet"/>
+      </w:pPr>
+      <w:r>
+        <w:rPr>
+          <w:sz w:val="22"/>
+          <w:rFonts w:eastAsia="맑은 고딕" w:ascii="맑은 고딕" w:hAnsi="맑은 고딕"/>
+        </w:rPr>
+        <w:t>forecast CSV ({year}_{season}_picaso.csv) 가 없는 시즌은 [SKIP] 자동 처리 — 에러 X</w:t>
+      </w:r>
+    </w:p>
+    <w:p>
+      <w:pPr>
+        <w:pStyle w:val="ListBullet"/>
+      </w:pPr>
+      <w:r>
+        <w:rPr>
+          <w:sz w:val="22"/>
+          <w:rFonts w:eastAsia="맑은 고딕" w:ascii="맑은 고딕" w:hAnsi="맑은 고딕"/>
+        </w:rPr>
+        <w:t>model.retrieve=true 일 경우 첫 시즌이 모델 적합·캐시 저장, 나머지 11 시즌은 캐시 재사용 (빠름)</w:t>
+      </w:r>
+    </w:p>
+    <w:p>
+      <w:pPr>
+        <w:pStyle w:val="Heading2"/>
+      </w:pPr>
+      <w:r>
+        <w:rPr>
+          <w:rFonts w:eastAsia="맑은 고딕" w:ascii="맑은 고딕" w:hAnsi="맑은 고딕"/>
+        </w:rPr>
+        <w:t>6.3 acidwg_py.yaml — operational 블록 작성</w:t>
       </w:r>
     </w:p>
     <w:p>
@@ -2794,7 +2990,7 @@
         <w:br/>
         <w:t xml:space="preserve">  station_csv: "$(paths.base_dir)/1_acidwg/config/stations.csv"</w:t>
         <w:br/>
-        <w:t xml:space="preserve">  obs_dir:     "$(paths.base_dir)/0_database/obs/weather/daily_std"</w:t>
+        <w:t xml:space="preserve">  obs_dir:     "$(paths.base_dir)/0_database/gsod/daily_std"</w:t>
         <w:br/>
         <w:t xml:space="preserve">  picaso_dir:  "$(paths.base_dir)/1_acidwg/picaso"</w:t>
         <w:br/>
@@ -2803,14 +2999,14 @@
         <w:t xml:space="preserve">  model_file:  "$(paths.base_dir)/1_acidwg/cache/acidwg_model.pkl"</w:t>
         <w:br/>
         <w:br/>
-        <w:t>observation: { syear: 1981, eyear: 2010 }</w:t>
+        <w:t>observation: { syear: 1981, eyear: 2024 }</w:t>
         <w:br/>
         <w:br/>
         <w:t>operational:</w:t>
         <w:br/>
-        <w:t xml:space="preserve">  year:   2024</w:t>
+        <w:t xml:space="preserve">  year:   2025</w:t>
         <w:br/>
-        <w:t xml:space="preserve">  season: "JFM"</w:t>
+        <w:t xml:space="preserve">  season: "JFM"     # 단일 실행 시 사용. --seasons 가 있으면 무시되고 CLI 인자 우선</w:t>
         <w:br/>
         <w:br/>
         <w:t>ensemble: { n_members: 1000, random_seed: 1 }</w:t>
@@ -2828,31 +3024,7 @@
         <w:rPr>
           <w:rFonts w:eastAsia="맑은 고딕" w:ascii="맑은 고딕" w:hAnsi="맑은 고딕"/>
         </w:rPr>
-        <w:t>6.3 Step 3 — 시나리오 생성</w:t>
-      </w:r>
-    </w:p>
-    <w:p>
-      <w:pPr>
-        <w:spacing w:before="80" w:after="80"/>
-        <w:ind w:left="283"/>
-        <w:shd w:val="clear" w:color="auto" w:fill="F2F2F2"/>
-      </w:pPr>
-      <w:r>
-        <w:rPr>
-          <w:rFonts w:ascii="Consolas" w:hAnsi="Consolas"/>
-          <w:sz w:val="20"/>
-        </w:rPr>
-        <w:t>acidwg-run</w:t>
-      </w:r>
-    </w:p>
-    <w:p>
-      <w:r>
-        <w:rPr>
-          <w:b w:val="0"/>
-          <w:sz w:val="22"/>
-          <w:rFonts w:eastAsia="맑은 고딕" w:ascii="맑은 고딕" w:hAnsi="맑은 고딕"/>
-        </w:rPr>
-        <w:t>yaml 자동 탐색 우선순위:</w:t>
+        <w:t>6.4 yaml 자동 탐색 우선순위</w:t>
       </w:r>
     </w:p>
     <w:p>
@@ -2888,7 +3060,7 @@
           <w:sz w:val="22"/>
           <w:rFonts w:eastAsia="맑은 고딕" w:ascii="맑은 고딕" w:hAnsi="맑은 고딕"/>
         </w:rPr>
-        <w:t>$PICASO_ROOT/1_acidwg/config/acidwg_py.yaml (권장 위치)</w:t>
+        <w:t>$PICASO_ROOT/1_acidwg/config/acidwg_py.yaml (★ 권장 위치)</w:t>
       </w:r>
     </w:p>
     <w:p>
@@ -2904,36 +3076,6 @@
       </w:r>
     </w:p>
     <w:p>
-      <w:r>
-        <w:rPr>
-          <w:b w:val="0"/>
-          <w:sz w:val="22"/>
-          <w:rFonts w:eastAsia="맑은 고딕" w:ascii="맑은 고딕" w:hAnsi="맑은 고딕"/>
-        </w:rPr>
-        <w:t>결과:</w:t>
-      </w:r>
-    </w:p>
-    <w:p>
-      <w:pPr>
-        <w:spacing w:before="80" w:after="80"/>
-        <w:ind w:left="283"/>
-        <w:shd w:val="clear" w:color="auto" w:fill="F2F2F2"/>
-      </w:pPr>
-      <w:r>
-        <w:rPr>
-          <w:rFonts w:ascii="Consolas" w:hAnsi="Consolas"/>
-          <w:sz w:val="20"/>
-        </w:rPr>
-        <w:t>1_acidwg/operational/2024/JFM/</w:t>
-        <w:br/>
-        <w:t xml:space="preserve">  member_0001/91843099999.csv</w:t>
-        <w:br/>
-        <w:t xml:space="preserve">  ...</w:t>
-        <w:br/>
-        <w:t xml:space="preserve">  member_1000/91843099999.csv</w:t>
-      </w:r>
-    </w:p>
-    <w:p>
       <w:pPr>
         <w:pStyle w:val="Heading2"/>
       </w:pPr>
@@ -2941,7 +3083,7 @@
         <w:rPr>
           <w:rFonts w:eastAsia="맑은 고딕" w:ascii="맑은 고딕" w:hAnsi="맑은 고딕"/>
         </w:rPr>
-        <w:t>6.4 Step 4 — SWAT-Plus 입력으로 사용</w:t>
+        <w:t>6.5 Step 4 — SWAT-Plus 입력으로 사용</w:t>
       </w:r>
     </w:p>
     <w:p>
@@ -3015,7 +3157,7 @@
           <w:sz w:val="22"/>
           <w:rFonts w:eastAsia="맑은 고딕" w:ascii="맑은 고딕" w:hAnsi="맑은 고딕"/>
         </w:rPr>
-        <w:t>출력: 1_acidwg/picaso/{year}_{season}_picaso.csv 약 360개. PICASO 원본이 없는 (year, season) 조합은 자동 건너뜀 (hindcast 실행 시에도 자동 skip).</w:t>
+        <w:t>출력: 1_acidwg/picaso/{year}_{season}_picaso.csv 약 360개. PICASO 원본이 없는 (year, season) 조합은 자동 건너뜀.</w:t>
       </w:r>
     </w:p>
     <w:p>
@@ -3026,7 +3168,7 @@
         <w:rPr>
           <w:rFonts w:eastAsia="맑은 고딕" w:ascii="맑은 고딕" w:hAnsi="맑은 고딕"/>
         </w:rPr>
-        <w:t>7.2 Step 2 — acidwg_py.yaml 에 hindcast 블록 추가</w:t>
+        <w:t>7.2 Step 2 — yaml 에 hindcast 블록 추가</w:t>
       </w:r>
     </w:p>
     <w:p>
@@ -3050,29 +3192,7 @@
           <w:rFonts w:ascii="Consolas" w:hAnsi="Consolas"/>
           <w:sz w:val="20"/>
         </w:rPr>
-        <w:t>paths:</w:t>
-        <w:br/>
-        <w:t xml:space="preserve">  base_dir:    "${env:PICASO_ROOT}"</w:t>
-        <w:br/>
-        <w:t xml:space="preserve">  station_csv: "$(paths.base_dir)/1_acidwg/config/stations.csv"</w:t>
-        <w:br/>
-        <w:t xml:space="preserve">  obs_dir:     "$(paths.base_dir)/0_database/obs/weather/daily_std"</w:t>
-        <w:br/>
-        <w:t xml:space="preserve">  picaso_dir:  "$(paths.base_dir)/1_acidwg/picaso"</w:t>
-        <w:br/>
-        <w:t xml:space="preserve">  output_root: "$(paths.base_dir)/1_acidwg"</w:t>
-        <w:br/>
-        <w:t xml:space="preserve">  model_file:  "$(paths.base_dir)/1_acidwg/cache/acidwg_model.pkl"</w:t>
-        <w:br/>
-        <w:br/>
-        <w:t>observation: { syear: 1981, eyear: 2010 }</w:t>
-        <w:br/>
-        <w:br/>
-        <w:t>operational:</w:t>
-        <w:br/>
-        <w:t xml:space="preserve">  year:   2024</w:t>
-        <w:br/>
-        <w:t xml:space="preserve">  season: "JFM"</w:t>
+        <w:t># (paths/observation/operational/ensemble/model/output 동일)</w:t>
         <w:br/>
         <w:br/>
         <w:t>hindcast:</w:t>
@@ -3082,13 +3202,6 @@
         <w:t xml:space="preserve">  seasons: "all"                      # 12 계절 전체</w:t>
         <w:br/>
         <w:t xml:space="preserve">  observation_eyear_cap: true         # 누설 방지 자동</w:t>
-        <w:br/>
-        <w:br/>
-        <w:t>ensemble: { n_members: 1000, random_seed: 1 }</w:t>
-        <w:br/>
-        <w:t>model:    { retrieve: true }</w:t>
-        <w:br/>
-        <w:t>output:   { overwrite: false, variables: [prcp, tmax, tmin] }</w:t>
       </w:r>
     </w:p>
     <w:p>
@@ -3113,7 +3226,7 @@
           <w:rFonts w:ascii="Consolas" w:hAnsi="Consolas"/>
           <w:sz w:val="20"/>
         </w:rPr>
-        <w:t>acidwg-run --hindcast              # yaml hindcast 블록 전체 (360 시즌)</w:t>
+        <w:t>acidwg-run --hindcast              # yaml hindcast 블록 전체 (예: 360 시즌)</w:t>
       </w:r>
     </w:p>
     <w:p>
@@ -3164,6 +3277,8 @@
         <w:t>acidwg-run --hindcast --years 2010 2015          # 특정 연도만</w:t>
         <w:br/>
         <w:t>acidwg-run --hindcast --seasons JFM FMA          # 특정 계절만</w:t>
+        <w:br/>
+        <w:t>acidwg-run --hindcast --seasons all              # all (operational 과 동일 문법)</w:t>
         <w:br/>
         <w:t>acidwg-run --hindcast --years 2015 --seasons JJA # 한 시즌만</w:t>
       </w:r>
@@ -3217,7 +3332,7 @@
         <w:rPr>
           <w:rFonts w:eastAsia="맑은 고딕" w:ascii="맑은 고딕" w:hAnsi="맑은 고딕"/>
         </w:rPr>
-        <w:t>7.5 결과 — 360 시즌 누적 폴더</w:t>
+        <w:t>7.5 결과 — 다년 × 다계절 누적 폴더</w:t>
       </w:r>
     </w:p>
     <w:p>
@@ -3233,17 +3348,9 @@
         </w:rPr>
         <w:t>1_acidwg/hindcast/</w:t>
         <w:br/>
-        <w:t xml:space="preserve">  1991/</w:t>
+        <w:t xml:space="preserve">  1991/JFM/member_0001 ~ member_1000/</w:t>
         <w:br/>
-        <w:t xml:space="preserve">    JFM/member_0001/91843099999.csv ~ member_1000/...</w:t>
-        <w:br/>
-        <w:t xml:space="preserve">    FMA/member_0001/...</w:t>
-        <w:br/>
-        <w:t xml:space="preserve">    ...</w:t>
-        <w:br/>
-        <w:t xml:space="preserve">    DJF/member_1000/...</w:t>
-        <w:br/>
-        <w:t xml:space="preserve">  1992/...</w:t>
+        <w:t xml:space="preserve">  1991/FMA/...</w:t>
         <w:br/>
         <w:t xml:space="preserve">  ...</w:t>
         <w:br/>
@@ -3257,7 +3364,7 @@
           <w:sz w:val="22"/>
           <w:rFonts w:eastAsia="맑은 고딕" w:ascii="맑은 고딕" w:hAnsi="맑은 고딕"/>
         </w:rPr>
-        <w:t>총 30 × 12 × 1000 = 360,000 멤버 CSV. 디스크 공간을 미리 확인하세요 (관측소 1개 기준 약 수 GB).</w:t>
+        <w:t>디스크 공간을 미리 확인하세요 (관측소 수 × 연도 × 계절 × 1000멤버 × 90일 ≒ 수 GB ~ 수십 GB).</w:t>
       </w:r>
     </w:p>
     <w:p>
@@ -3299,10 +3406,8 @@
         <w:br/>
         <w:t>base = Path("1_acidwg/hindcast")</w:t>
         <w:br/>
-        <w:t>year, season, station = 2010, "JFM", "91843099999"</w:t>
+        <w:t>year, season, station = 2010, "JFM", "918430"</w:t>
         <w:br/>
-        <w:br/>
-        <w:t># 1000 멤버 일강수량 행렬</w:t>
         <w:br/>
         <w:t>prcp_ens = []</w:t>
         <w:br/>
@@ -3315,14 +3420,10 @@
         <w:t>ens = np.stack(prcp_ens)        # (1000, n_days)</w:t>
         <w:br/>
         <w:br/>
-        <w:t># 실제 관측</w:t>
-        <w:br/>
-        <w:t>obs = pd.read_csv(f"0_database/obs/weather/daily_std/{station}.csv")</w:t>
+        <w:t>obs = pd.read_csv(f"0_database/gsod/daily_std/{station}.csv")</w:t>
         <w:br/>
         <w:t>obs = obs[(obs.date &gt;= f"{year}-01-01") &amp; (obs.date &lt;= f"{year}-03-31")]</w:t>
         <w:br/>
-        <w:br/>
-        <w:t># 시즌 합계 비교</w:t>
         <w:br/>
         <w:t>ens_total = ens.sum(axis=1)</w:t>
         <w:br/>
@@ -3558,7 +3659,7 @@
                 <w:sz w:val="20"/>
                 <w:rFonts w:eastAsia="맑은 고딕" w:ascii="맑은 고딕" w:hAnsi="맑은 고딕"/>
               </w:rPr>
-              <w:t>0_database/obs/weather/daily_std</w:t>
+              <w:t>obs/weather/daily_std 또는 gsod/daily_std</w:t>
             </w:r>
           </w:p>
         </w:tc>
@@ -3728,7 +3829,7 @@
         </w:rPr>
         <w:t>forecast_csv = picaso_dir/{year}_{season}_picaso.csv</w:t>
         <w:br/>
-        <w:t>output_dir   = output_root/operational/{year}/{season}/</w:t>
+        <w:t>output_dir   = output_root/{operational|hindcast}/{year}/{season}/</w:t>
       </w:r>
     </w:p>
     <w:p>
@@ -3845,7 +3946,7 @@
                 <w:sz w:val="20"/>
                 <w:rFonts w:eastAsia="맑은 고딕" w:ascii="맑은 고딕" w:hAnsi="맑은 고딕"/>
               </w:rPr>
-              <w:t>관측 종료 연도 (예: 2010)</w:t>
+              <w:t>관측 종료 연도 (예: 2024)</w:t>
             </w:r>
           </w:p>
         </w:tc>
@@ -3869,7 +3970,7 @@
         <w:rPr>
           <w:rFonts w:eastAsia="맑은 고딕" w:ascii="맑은 고딕" w:hAnsi="맑은 고딕"/>
         </w:rPr>
-        <w:t>8.3 operational — 단일 시즌 (acidwg-run)</w:t>
+        <w:t>8.3 operational — 단일/일괄 시즌</w:t>
       </w:r>
     </w:p>
     <w:tbl>
@@ -3975,7 +4076,7 @@
                 <w:sz w:val="20"/>
                 <w:rFonts w:eastAsia="맑은 고딕" w:ascii="맑은 고딕" w:hAnsi="맑은 고딕"/>
               </w:rPr>
-              <w:t>2024</w:t>
+              <w:t>2025</w:t>
             </w:r>
           </w:p>
         </w:tc>
@@ -4007,7 +4108,7 @@
                 <w:sz w:val="20"/>
                 <w:rFonts w:eastAsia="맑은 고딕" w:ascii="맑은 고딕" w:hAnsi="맑은 고딕"/>
               </w:rPr>
-              <w:t>12개 계절 코드 중 하나</w:t>
+              <w:t>yaml 단일 실행 기본 — CLI --seasons 사용 시 무시</w:t>
             </w:r>
           </w:p>
         </w:tc>
@@ -4054,7 +4155,7 @@
                 <w:sz w:val="20"/>
                 <w:rFonts w:eastAsia="맑은 고딕" w:ascii="맑은 고딕" w:hAnsi="맑은 고딕"/>
               </w:rPr>
-              <w:t>직접 월 목록 (season 무시)</w:t>
+              <w:t>직접 월 목록 (season 무시, --seasons 와는 비호환)</w:t>
             </w:r>
           </w:p>
         </w:tc>
@@ -4083,6 +4184,16 @@
           <w:rFonts w:eastAsia="맑은 고딕" w:ascii="맑은 고딕" w:hAnsi="맑은 고딕"/>
         </w:rPr>
         <w:t>DJF/NDJ 등 연도 경계 시즌은 year 가 시즌 첫 월의 연도 (예: NDJ 2024 → 2024-11 + 2024-12 + 2025-01).</w:t>
+      </w:r>
+    </w:p>
+    <w:p>
+      <w:r>
+        <w:rPr>
+          <w:b w:val="0"/>
+          <w:sz w:val="22"/>
+          <w:rFonts w:eastAsia="맑은 고딕" w:ascii="맑은 고딕" w:hAnsi="맑은 고딕"/>
+        </w:rPr>
+        <w:t>★ CLI --seasons 플래그로 일괄 실행 시 yaml.operational.season 은 무시되고 CLI 인자가 적용됩니다. 즉 yaml 한 파일로 단일/일괄 모두 가능 — yaml 수정 불필요.</w:t>
       </w:r>
     </w:p>
     <w:p>
@@ -4562,7 +4673,9 @@
               </w:rPr>
               <w:t>true: model_file 캐시 사용 (operational 빠름).</w:t>
               <w:br/>
-              <w:t>hindcast + observation_eyear_cap=true → 자동 false (관측이 매년 다르므로 캐시 무의미)</w:t>
+              <w:t xml:space="preserve">  - operational --seasons 일괄: 첫 시즌 적합·저장, 나머지는 캐시 로드</w:t>
+              <w:br/>
+              <w:t xml:space="preserve">  - hindcast + observation_eyear_cap=true: 자동 false (관측이 매년 다르므로 캐시 무의미)</w:t>
             </w:r>
           </w:p>
         </w:tc>
@@ -4984,7 +5097,7 @@
           <w:sz w:val="22"/>
           <w:rFonts w:eastAsia="맑은 고딕" w:ascii="맑은 고딕" w:hAnsi="맑은 고딕"/>
         </w:rPr>
-        <w:t>Operational:</w:t>
+        <w:t>Operational (단일 또는 일괄):</w:t>
       </w:r>
     </w:p>
     <w:p>
@@ -5399,7 +5512,7 @@
           <w:sz w:val="22"/>
           <w:rFonts w:eastAsia="맑은 고딕" w:ascii="맑은 고딕" w:hAnsi="맑은 고딕"/>
         </w:rPr>
-        <w:t>행 수 = 시즌 일수 (JFM = 31+29 또는 28+31 = 90 또는 89). 각 멤버는 동일 확률 분포로부터 독립 샘플.</w:t>
+        <w:t>행 수 = 시즌 일수 (JFM = 31+28+31 = 90일). 각 멤버는 동일 확률 분포로부터 독립 샘플.</w:t>
       </w:r>
     </w:p>
     <w:p>
@@ -6252,7 +6365,28 @@
         <w:rPr>
           <w:rFonts w:eastAsia="맑은 고딕" w:ascii="맑은 고딕" w:hAnsi="맑은 고딕"/>
         </w:rPr>
-        <w:t>11.5 "hindcast.years 는 [start, end] 또는 [y1, y2, ...] 형식"</w:t>
+        <w:t>11.5 "지원하지 않는 계절 코드 'XYZ'"</w:t>
+      </w:r>
+    </w:p>
+    <w:p>
+      <w:r>
+        <w:rPr>
+          <w:b w:val="0"/>
+          <w:sz w:val="22"/>
+          <w:rFonts w:eastAsia="맑은 고딕" w:ascii="맑은 고딕" w:hAnsi="맑은 고딕"/>
+        </w:rPr>
+        <w:t>--seasons 인자에 12 계절 코드 (JFM, FMA, ..., DJF) 또는 'all' 사용. 대소문자 무관 (jfm 도 인식).</w:t>
+      </w:r>
+    </w:p>
+    <w:p>
+      <w:pPr>
+        <w:pStyle w:val="Heading2"/>
+      </w:pPr>
+      <w:r>
+        <w:rPr>
+          <w:rFonts w:eastAsia="맑은 고딕" w:ascii="맑은 고딕" w:hAnsi="맑은 고딕"/>
+        </w:rPr>
+        <w:t>11.6 "hindcast.years 는 [start, end] 또는 [y1, y2, ...] 형식"</w:t>
       </w:r>
     </w:p>
     <w:p>
@@ -6273,7 +6407,7 @@
         <w:rPr>
           <w:rFonts w:eastAsia="맑은 고딕" w:ascii="맑은 고딕" w:hAnsi="맑은 고딕"/>
         </w:rPr>
-        <w:t>11.6 hindcast 가 일부 시즌을 "forecast CSV 없음" 으로 건너뜀</w:t>
+        <w:t>11.7 일부 시즌이 "forecast CSV 없음" 으로 건너뜀</w:t>
       </w:r>
     </w:p>
     <w:p>
@@ -6283,7 +6417,7 @@
           <w:sz w:val="22"/>
           <w:rFonts w:eastAsia="맑은 고딕" w:ascii="맑은 고딕" w:hAnsi="맑은 고딕"/>
         </w:rPr>
-        <w:t>PICASO 원본이 그 (year, season) 조합에 없거나, acidwg-picaso-convert 가 그 조합을 변환하지 못한 경우. dry-run 으로 어떤 조합이 누락됐는지 확인 후 PICASO 자료 보완.</w:t>
+        <w:t>PICASO 원본이 그 (year, season) 조합에 없거나, acidwg-picaso-convert 가 그 조합을 변환하지 못한 경우. --dry-run 으로 어떤 조합이 누락됐는지 확인 후 PICASO 자료 보완.</w:t>
       </w:r>
     </w:p>
     <w:p>
@@ -6294,7 +6428,7 @@
         <w:rPr>
           <w:rFonts w:eastAsia="맑은 고딕" w:ascii="맑은 고딕" w:hAnsi="맑은 고딕"/>
         </w:rPr>
-        <w:t>11.7 "AN+NN+BN 합이 100이 아닌 행"</w:t>
+        <w:t>11.8 "AN+NN+BN 합이 100이 아닌 행"</w:t>
       </w:r>
     </w:p>
     <w:p>
@@ -6315,7 +6449,7 @@
         <w:rPr>
           <w:rFonts w:eastAsia="맑은 고딕" w:ascii="맑은 고딕" w:hAnsi="맑은 고딕"/>
         </w:rPr>
-        <w:t>11.8 시나리오 값이 비현실적</w:t>
+        <w:t>11.9 시나리오 값이 비현실적</w:t>
       </w:r>
     </w:p>
     <w:p>
@@ -6336,7 +6470,7 @@
         <w:rPr>
           <w:rFonts w:eastAsia="맑은 고딕" w:ascii="맑은 고딕" w:hAnsi="맑은 고딕"/>
         </w:rPr>
-        <w:t>11.9 "관측 기간 부족" hindcast skip</w:t>
+        <w:t>11.10 "관측 기간 부족" hindcast skip</w:t>
       </w:r>
     </w:p>
     <w:p>
@@ -6347,6 +6481,27 @@
           <w:rFonts w:eastAsia="맑은 고딕" w:ascii="맑은 고딕" w:hAnsi="맑은 고딕"/>
         </w:rPr>
         <w:t>observation_eyear_cap=true 인데 hindcast 연도가 syear+1 이하인 경우 발생. 예: syear=1981, hindcast year=1981 → eyear_cap=1980 &lt; syear → 건너뜀. 더 이른 연도 hindcast 가 필요하면 syear 를 더 일찍 설정.</w:t>
+      </w:r>
+    </w:p>
+    <w:p>
+      <w:pPr>
+        <w:pStyle w:val="Heading2"/>
+      </w:pPr>
+      <w:r>
+        <w:rPr>
+          <w:rFonts w:eastAsia="맑은 고딕" w:ascii="맑은 고딕" w:hAnsi="맑은 고딕"/>
+        </w:rPr>
+        <w:t>11.11 "yaml.operational 에 'months' 직접 지정한 경우 --seasons 일괄 모드 사용 불가"</w:t>
+      </w:r>
+    </w:p>
+    <w:p>
+      <w:r>
+        <w:rPr>
+          <w:b w:val="0"/>
+          <w:sz w:val="22"/>
+          <w:rFonts w:eastAsia="맑은 고딕" w:ascii="맑은 고딕" w:hAnsi="맑은 고딕"/>
+        </w:rPr>
+        <w:t>yaml 의 operational.months 와 CLI --seasons 는 비호환. months 를 season 코드로 변경 후 --seasons 사용.</w:t>
       </w:r>
     </w:p>
     <w:p>
@@ -6396,7 +6551,7 @@
           <w:sz w:val="22"/>
           <w:rFonts w:eastAsia="맑은 고딕" w:ascii="맑은 고딕" w:hAnsi="맑은 고딕"/>
         </w:rPr>
-        <w:t>관측: GSOD 91843099999 (Rarotonga AP), 1981–2010, util_py 표준화 완료</w:t>
+        <w:t>관측: GSOD 918430 (Rarotonga AP, USAF 6자), 1981–2024, util_py 표준화 완료</w:t>
       </w:r>
     </w:p>
     <w:p>
@@ -6408,7 +6563,7 @@
           <w:sz w:val="22"/>
           <w:rFonts w:eastAsia="맑은 고딕" w:ascii="맑은 고딕" w:hAnsi="맑은 고딕"/>
         </w:rPr>
-        <w:t>예보: APCC 2024 JFM (operational) + 1991–2020 전 계절 (hindcast)</w:t>
+        <w:t>예보: 2025 운영 + 2013–2024 hindcast</w:t>
       </w:r>
     </w:p>
     <w:p>
@@ -6447,13 +6602,13 @@
         </w:rPr>
         <w:t>I:\2025-APCC_Cook\PICASO-Hydro\</w:t>
         <w:br/>
-        <w:t>├─ 0_database\obs\weather\daily_std\91843099999.csv  (date,pcp_mm,tmax_c,...)</w:t>
+        <w:t>├─ 0_database\gsod\daily_std\918430.csv  (date,pcp_mm,tmax_c,...)</w:t>
         <w:br/>
-        <w:t>├─ 0_database\picaso\...                              (사업단 제공)</w:t>
+        <w:t>├─ 0_database\picaso\...                  (사업단 제공)</w:t>
         <w:br/>
         <w:t>└─ 1_acidwg\config\</w:t>
         <w:br/>
-        <w:t xml:space="preserve">    ├─ stations.csv                                     # 1행</w:t>
+        <w:t xml:space="preserve">    ├─ stations.csv                         # 1행</w:t>
         <w:br/>
         <w:t xml:space="preserve">    └─ acidwg_py.yaml</w:t>
       </w:r>
@@ -6473,7 +6628,7 @@
         <w:br/>
         <w:t>Lon,Lat,Elev,ID,Ename,SYear</w:t>
         <w:br/>
-        <w:t>-159.81,-21.20,5,91843099999,Rarotonga,1981</w:t>
+        <w:t>-159.806,-21.203,5.8,918430,RAROTONGA INTL,1973</w:t>
       </w:r>
     </w:p>
     <w:p>
@@ -6504,7 +6659,7 @@
         <w:br/>
         <w:t xml:space="preserve">  station_csv: "$(paths.base_dir)/1_acidwg/config/stations.csv"</w:t>
         <w:br/>
-        <w:t xml:space="preserve">  obs_dir:     "$(paths.base_dir)/0_database/obs/weather/daily_std"</w:t>
+        <w:t xml:space="preserve">  obs_dir:     "$(paths.base_dir)/0_database/gsod/daily_std"</w:t>
         <w:br/>
         <w:t xml:space="preserve">  picaso_dir:  "$(paths.base_dir)/1_acidwg/picaso"</w:t>
         <w:br/>
@@ -6513,19 +6668,19 @@
         <w:t xml:space="preserve">  model_file:  "$(paths.base_dir)/1_acidwg/cache/acidwg_model.pkl"</w:t>
         <w:br/>
         <w:br/>
-        <w:t>observation: { syear: 1981, eyear: 2010 }</w:t>
+        <w:t>observation: { syear: 1981, eyear: 2024 }</w:t>
         <w:br/>
         <w:br/>
         <w:t>operational:</w:t>
         <w:br/>
-        <w:t xml:space="preserve">  year:   2024</w:t>
+        <w:t xml:space="preserve">  year:   2025</w:t>
         <w:br/>
         <w:t xml:space="preserve">  season: "JFM"</w:t>
         <w:br/>
         <w:br/>
         <w:t>hindcast:</w:t>
         <w:br/>
-        <w:t xml:space="preserve">  years:   [1991, 2020]              # 30년 hindcast</w:t>
+        <w:t xml:space="preserve">  years:   [2013, 2024]              # 12년</w:t>
         <w:br/>
         <w:t xml:space="preserve">  seasons: "all"                      # 12 계절</w:t>
         <w:br/>
@@ -6547,7 +6702,7 @@
         <w:rPr>
           <w:rFonts w:eastAsia="맑은 고딕" w:ascii="맑은 고딕" w:hAnsi="맑은 고딕"/>
         </w:rPr>
-        <w:t>12.4 Operational 실행</w:t>
+        <w:t>12.4 Operational — 단일 (2025 JFM)</w:t>
       </w:r>
     </w:p>
     <w:p>
@@ -6563,12 +6718,12 @@
         </w:rPr>
         <w:t>set PICASO_ROOT=I:\2025-APCC_Cook\PICASO-Hydro</w:t>
         <w:br/>
-        <w:t>acidwg-picaso-convert --seasons JFM --years 2024</w:t>
+        <w:t>acidwg-picaso-convert --seasons JFM --years 2025</w:t>
         <w:br/>
         <w:t>acidwg-run</w:t>
         <w:br/>
         <w:br/>
-        <w:t># 결과: 1_acidwg\operational\2024\JFM\member_NNNN\91843099999.csv (1000개)</w:t>
+        <w:t># 결과: 1_acidwg\operational\2025\JFM\member_NNNN\918430.csv (1000개)</w:t>
       </w:r>
     </w:p>
     <w:p>
@@ -6579,7 +6734,7 @@
         <w:rPr>
           <w:rFonts w:eastAsia="맑은 고딕" w:ascii="맑은 고딕" w:hAnsi="맑은 고딕"/>
         </w:rPr>
-        <w:t>12.5 Hindcast 실행</w:t>
+        <w:t>12.5 Operational — 한 해 12 계절 일괄 (★ 신규)</w:t>
       </w:r>
     </w:p>
     <w:p>
@@ -6593,14 +6748,24 @@
           <w:rFonts w:ascii="Consolas" w:hAnsi="Consolas"/>
           <w:sz w:val="20"/>
         </w:rPr>
-        <w:t>acidwg-picaso-convert --years 1991 1992 1993 ... 2020   # 또는 인자 없이</w:t>
+        <w:t>set PICASO_ROOT=I:\2025-APCC_Cook\PICASO-Hydro</w:t>
         <w:br/>
-        <w:t>acidwg-run --hindcast --dry-run                         # 처리 대상 미리 확인</w:t>
+        <w:t>acidwg-picaso-convert --years 2025</w:t>
         <w:br/>
-        <w:t>acidwg-run --hindcast                                    # 30 × 12 = 360 시즌 실행</w:t>
+        <w:t>acidwg-run --seasons all --dry-run        # 처리 대상 미리 확인</w:t>
+        <w:br/>
+        <w:t>acidwg-run --seasons all                   # 12 계절 모두 실행</w:t>
         <w:br/>
         <w:br/>
-        <w:t># 결과: 1_acidwg\hindcast\{1991..2020}\{12 seasons}\member_NNNN\91843099999.csv</w:t>
+        <w:t># 결과:</w:t>
+        <w:br/>
+        <w:t>#   1_acidwg\operational\2025\JFM\member_NNNN\918430.csv</w:t>
+        <w:br/>
+        <w:t>#   1_acidwg\operational\2025\FMA\...</w:t>
+        <w:br/>
+        <w:t>#   ...</w:t>
+        <w:br/>
+        <w:t>#   1_acidwg\operational\2025\DJF\member_NNNN\918430.csv</w:t>
       </w:r>
     </w:p>
     <w:p>
@@ -6611,7 +6776,7 @@
         <w:rPr>
           <w:rFonts w:eastAsia="맑은 고딕" w:ascii="맑은 고딕" w:hAnsi="맑은 고딕"/>
         </w:rPr>
-        <w:t>12.6 결과 검증</w:t>
+        <w:t>12.6 Hindcast — 12년 × 12 계절</w:t>
       </w:r>
     </w:p>
     <w:p>
@@ -6625,14 +6790,46 @@
           <w:rFonts w:ascii="Consolas" w:hAnsi="Consolas"/>
           <w:sz w:val="20"/>
         </w:rPr>
-        <w:t>dir 1_acidwg\operational\2024\JFM\member_0001\</w:t>
+        <w:t>acidwg-picaso-convert --years 2013 2014 ... 2024  # 또는 인자 없이 (전체)</w:t>
         <w:br/>
-        <w:t xml:space="preserve">   91843099999.csv</w:t>
+        <w:t>acidwg-run --hindcast --dry-run                   # 144 시즌 대상 확인</w:t>
+        <w:br/>
+        <w:t>acidwg-run --hindcast                              # 12 × 12 = 144 시즌 실행</w:t>
         <w:br/>
         <w:br/>
-        <w:t>dir 1_acidwg\hindcast\2010\JFM\member_0001\</w:t>
+        <w:t># 결과: 1_acidwg\hindcast\{2013..2024}\{12 seasons}\member_NNNN\918430.csv</w:t>
+      </w:r>
+    </w:p>
+    <w:p>
+      <w:pPr>
+        <w:pStyle w:val="Heading2"/>
+      </w:pPr>
+      <w:r>
+        <w:rPr>
+          <w:rFonts w:eastAsia="맑은 고딕" w:ascii="맑은 고딕" w:hAnsi="맑은 고딕"/>
+        </w:rPr>
+        <w:t>12.7 결과 검증</w:t>
+      </w:r>
+    </w:p>
+    <w:p>
+      <w:pPr>
+        <w:spacing w:before="80" w:after="80"/>
+        <w:ind w:left="283"/>
+        <w:shd w:val="clear" w:color="auto" w:fill="F2F2F2"/>
+      </w:pPr>
+      <w:r>
+        <w:rPr>
+          <w:rFonts w:ascii="Consolas" w:hAnsi="Consolas"/>
+          <w:sz w:val="20"/>
+        </w:rPr>
+        <w:t>dir 1_acidwg\operational\2025\JFM\member_0001\</w:t>
         <w:br/>
-        <w:t xml:space="preserve">   91843099999.csv</w:t>
+        <w:t xml:space="preserve">   918430.csv</w:t>
+        <w:br/>
+        <w:br/>
+        <w:t>dir 1_acidwg\hindcast\2020\JFM\member_0001\</w:t>
+        <w:br/>
+        <w:t xml:space="preserve">   918430.csv</w:t>
       </w:r>
     </w:p>
     <w:p>
@@ -6660,7 +6857,7 @@
         <w:rPr>
           <w:rFonts w:eastAsia="맑은 고딕" w:ascii="맑은 고딕" w:hAnsi="맑은 고딕"/>
         </w:rPr>
-        <w:t>A.1 Operational (단일 시즌)</w:t>
+        <w:t>A.1 Operational (단일 또는 일괄)</w:t>
       </w:r>
     </w:p>
     <w:p>
@@ -6696,7 +6893,7 @@
           <w:sz w:val="22"/>
           <w:rFonts w:eastAsia="맑은 고딕" w:ascii="맑은 고딕" w:hAnsi="맑은 고딕"/>
         </w:rPr>
-        <w:t>0_database/obs/weather/daily_std/{ID}.csv 표준 daily 포맷 (util-weather-standardize)</w:t>
+        <w:t>0_database/{obs/weather,gsod}/daily_std/{ID}.csv (util-weather-standardize 출력)</w:t>
       </w:r>
     </w:p>
     <w:p>
@@ -6720,7 +6917,7 @@
           <w:sz w:val="22"/>
           <w:rFonts w:eastAsia="맑은 고딕" w:ascii="맑은 고딕" w:hAnsi="맑은 고딕"/>
         </w:rPr>
-        <w:t>acidwg-picaso-convert 로 forecast CSV 생성 (해당 year/season)</w:t>
+        <w:t>acidwg-picaso-convert 로 forecast CSV 생성</w:t>
       </w:r>
     </w:p>
     <w:p>
@@ -6732,7 +6929,7 @@
           <w:sz w:val="22"/>
           <w:rFonts w:eastAsia="맑은 고딕" w:ascii="맑은 고딕" w:hAnsi="맑은 고딕"/>
         </w:rPr>
-        <w:t>1_acidwg/config/acidwg_py.yaml 작성 (operational 블록)</w:t>
+        <w:t>1_acidwg/config/acidwg_py.yaml 작성 (operational 블록 + 선택적 hindcast 블록)</w:t>
       </w:r>
     </w:p>
     <w:p>
@@ -6744,7 +6941,7 @@
           <w:sz w:val="22"/>
           <w:rFonts w:eastAsia="맑은 고딕" w:ascii="맑은 고딕" w:hAnsi="맑은 고딕"/>
         </w:rPr>
-        <w:t>acidwg-run 실행</w:t>
+        <w:t>단일: acidwg-run / 일괄: acidwg-run --seasons all</w:t>
       </w:r>
     </w:p>
     <w:p>
@@ -6767,19 +6964,7 @@
           <w:sz w:val="22"/>
           <w:rFonts w:eastAsia="맑은 고딕" w:ascii="맑은 고딕" w:hAnsi="맑은 고딕"/>
         </w:rPr>
-        <w:t>위 A.1 의 1~4 모두 동일</w:t>
-      </w:r>
-    </w:p>
-    <w:p>
-      <w:pPr>
-        <w:pStyle w:val="ListBullet"/>
-      </w:pPr>
-      <w:r>
-        <w:rPr>
-          <w:sz w:val="22"/>
-          <w:rFonts w:eastAsia="맑은 고딕" w:ascii="맑은 고딕" w:hAnsi="맑은 고딕"/>
-        </w:rPr>
-        <w:t>acidwg-picaso-convert 로 hindcast 기간 전체 forecast CSV 생성</w:t>
+        <w:t>위 A.1 의 1~5 모두 동일 + hindcast 기간 전체 forecast CSV 생성</w:t>
       </w:r>
     </w:p>
     <w:p>
@@ -6803,7 +6988,7 @@
           <w:sz w:val="22"/>
           <w:rFonts w:eastAsia="맑은 고딕" w:ascii="맑은 고딕" w:hAnsi="맑은 고딕"/>
         </w:rPr>
-        <w:t>디스크 공간 확인 (관측소 1개 ×30년 ×12계절 ×1000멤버 ×90일 ≒ 수 GB ~ 수십 GB)</w:t>
+        <w:t>디스크 공간 확인 (관측소 수 × 연도 × 계절 × 1000멤버 × 90일 ≒ 수 GB ~ 수십 GB)</w:t>
       </w:r>
     </w:p>
     <w:p>
@@ -7009,7 +7194,103 @@
                 <w:sz w:val="20"/>
                 <w:rFonts w:eastAsia="맑은 고딕" w:ascii="맑은 고딕" w:hAnsi="맑은 고딕"/>
               </w:rPr>
-              <w:t>operational 단발 (yaml operational 블록)</w:t>
+              <w:t>operational 단발 (yaml.operational 단일)</w:t>
+            </w:r>
+          </w:p>
+        </w:tc>
+      </w:tr>
+      <w:tr>
+        <w:tc>
+          <w:tcPr>
+            <w:tcW w:type="dxa" w:w="4252"/>
+          </w:tcPr>
+          <w:p>
+            <w:r/>
+            <w:r>
+              <w:rPr>
+                <w:sz w:val="20"/>
+                <w:rFonts w:eastAsia="맑은 고딕" w:ascii="맑은 고딕" w:hAnsi="맑은 고딕"/>
+              </w:rPr>
+              <w:t>acidwg-run --seasons all</w:t>
+            </w:r>
+          </w:p>
+        </w:tc>
+        <w:tc>
+          <w:tcPr>
+            <w:tcW w:type="dxa" w:w="4535"/>
+          </w:tcPr>
+          <w:p>
+            <w:r/>
+            <w:r>
+              <w:rPr>
+                <w:sz w:val="20"/>
+                <w:rFonts w:eastAsia="맑은 고딕" w:ascii="맑은 고딕" w:hAnsi="맑은 고딕"/>
+              </w:rPr>
+              <w:t>★ operational 일괄 (한 해 12 계절)</w:t>
+            </w:r>
+          </w:p>
+        </w:tc>
+      </w:tr>
+      <w:tr>
+        <w:tc>
+          <w:tcPr>
+            <w:tcW w:type="dxa" w:w="4252"/>
+          </w:tcPr>
+          <w:p>
+            <w:r/>
+            <w:r>
+              <w:rPr>
+                <w:sz w:val="20"/>
+                <w:rFonts w:eastAsia="맑은 고딕" w:ascii="맑은 고딕" w:hAnsi="맑은 고딕"/>
+              </w:rPr>
+              <w:t>acidwg-run --seasons JFM FMA</w:t>
+            </w:r>
+          </w:p>
+        </w:tc>
+        <w:tc>
+          <w:tcPr>
+            <w:tcW w:type="dxa" w:w="4535"/>
+          </w:tcPr>
+          <w:p>
+            <w:r/>
+            <w:r>
+              <w:rPr>
+                <w:sz w:val="20"/>
+                <w:rFonts w:eastAsia="맑은 고딕" w:ascii="맑은 고딕" w:hAnsi="맑은 고딕"/>
+              </w:rPr>
+              <w:t>★ operational 일괄 (특정 계절들)</w:t>
+            </w:r>
+          </w:p>
+        </w:tc>
+      </w:tr>
+      <w:tr>
+        <w:tc>
+          <w:tcPr>
+            <w:tcW w:type="dxa" w:w="4252"/>
+          </w:tcPr>
+          <w:p>
+            <w:r/>
+            <w:r>
+              <w:rPr>
+                <w:sz w:val="20"/>
+                <w:rFonts w:eastAsia="맑은 고딕" w:ascii="맑은 고딕" w:hAnsi="맑은 고딕"/>
+              </w:rPr>
+              <w:t>acidwg-run --seasons all --dry-run</w:t>
+            </w:r>
+          </w:p>
+        </w:tc>
+        <w:tc>
+          <w:tcPr>
+            <w:tcW w:type="dxa" w:w="4535"/>
+          </w:tcPr>
+          <w:p>
+            <w:r/>
+            <w:r>
+              <w:rPr>
+                <w:sz w:val="20"/>
+                <w:rFonts w:eastAsia="맑은 고딕" w:ascii="맑은 고딕" w:hAnsi="맑은 고딕"/>
+              </w:rPr>
+              <w:t>★ operational 처리 대상 미리 확인</w:t>
             </w:r>
           </w:p>
         </w:tc>
@@ -7041,7 +7322,7 @@
                 <w:sz w:val="20"/>
                 <w:rFonts w:eastAsia="맑은 고딕" w:ascii="맑은 고딕" w:hAnsi="맑은 고딕"/>
               </w:rPr>
-              <w:t>특정 yaml</w:t>
+              <w:t>특정 yaml 명시</w:t>
             </w:r>
           </w:p>
         </w:tc>
@@ -7073,7 +7354,7 @@
                 <w:sz w:val="20"/>
                 <w:rFonts w:eastAsia="맑은 고딕" w:ascii="맑은 고딕" w:hAnsi="맑은 고딕"/>
               </w:rPr>
-              <w:t>hindcast 일괄 (yaml hindcast 블록 전체)</w:t>
+              <w:t>hindcast 일괄 (yaml.hindcast 블록 전체)</w:t>
             </w:r>
           </w:p>
         </w:tc>
@@ -7105,7 +7386,7 @@
                 <w:sz w:val="20"/>
                 <w:rFonts w:eastAsia="맑은 고딕" w:ascii="맑은 고딕" w:hAnsi="맑은 고딕"/>
               </w:rPr>
-              <w:t>처리 대상 미리 확인 (실행 X)</w:t>
+              <w:t>hindcast 대상 미리 확인</w:t>
             </w:r>
           </w:p>
         </w:tc>
@@ -7170,6 +7451,38 @@
                 <w:rFonts w:eastAsia="맑은 고딕" w:ascii="맑은 고딕" w:hAnsi="맑은 고딕"/>
               </w:rPr>
               <w:t>hindcast 일부 계절만</w:t>
+            </w:r>
+          </w:p>
+        </w:tc>
+      </w:tr>
+      <w:tr>
+        <w:tc>
+          <w:tcPr>
+            <w:tcW w:type="dxa" w:w="4252"/>
+          </w:tcPr>
+          <w:p>
+            <w:r/>
+            <w:r>
+              <w:rPr>
+                <w:sz w:val="20"/>
+                <w:rFonts w:eastAsia="맑은 고딕" w:ascii="맑은 고딕" w:hAnsi="맑은 고딕"/>
+              </w:rPr>
+              <w:t>acidwg-run --hindcast --years 2020 --seasons all</w:t>
+            </w:r>
+          </w:p>
+        </w:tc>
+        <w:tc>
+          <w:tcPr>
+            <w:tcW w:type="dxa" w:w="4535"/>
+          </w:tcPr>
+          <w:p>
+            <w:r/>
+            <w:r>
+              <w:rPr>
+                <w:sz w:val="20"/>
+                <w:rFonts w:eastAsia="맑은 고딕" w:ascii="맑은 고딕" w:hAnsi="맑은 고딕"/>
+              </w:rPr>
+              <w:t>hindcast 한 해 전 계절만</w:t>
             </w:r>
           </w:p>
         </w:tc>

</xml_diff>